<commit_message>
Fix conclusion status stuck + cancelled project double-counted on Dashboard
1) Concluir Projeto now also sets etapa_atual/sub_status to CONCLUIDO, so a
   project that reached 100% Go-Live and was concluded no longer stays
   "PENDENTE TERMO DE ACEITE". SQL repairs rows already concluded in the old
   state (sql/2026-09-02_fix_conclusao_pendente_termo_aceite.sql).

2) Dashboard "Consolidacao por Fase": phase rows now exclude
   CANCELADO/REPROVADO globally (only BC did before), so a project cancelled
   in an advanced phase is no longer counted both in its phase row and in
   the "Projetos Cancelados" row, inflating the TOTAL GERAL.

Also regenerates Documento_Lacunas_COMPASSO.docx (v5.0). Manual_Funcional
docx pending (file locked/open).

Co-Authored-By: Claude Sonnet 5 <noreply@anthropic.com>
</commit_message>
<xml_diff>
--- a/docs/Documento_Lacunas_COMPASSO.docx
+++ b/docs/Documento_Lacunas_COMPASSO.docx
@@ -39,12 +39,12 @@
     </w:p>
     <w:p>
       <w:r>
-        <w:t>Versão 4.0 — 2 de setembro de 2026</w:t>
+        <w:t>Versão 5.0 — 2 de setembro de 2026</w:t>
       </w:r>
     </w:p>
     <w:p>
       <w:r>
-        <w:t>Primeira versão sob a marca Compasso. Atualizado após: papel PROPRIETÁRIO e Licenciamento de Módulos; permissões por atividade com 4 verbos (Consultar/Incluir/Alterar/Deletar) e ativação de RLS nas tabelas centrais de controle de acesso; Cadastro de Produtos e Produto obrigatório na demanda; Agrupamento de Orçamento por Ano Fiscal/Área/Produto com novo Quadro de Orçamento; tela de Ajuste de Orçamento; e a padronização de nomenclatura.</w:t>
+        <w:t>Atualizado após: tela de Fechamento Ano Fiscal (fechamento formal do AF + decisão de Carryover/Hold/Cancelamento projeto a projeto, substituindo "Projetos Carry Over"); seletor de Ano Fiscal alimentado pela configuração de Anos Fiscais (não pela data); Quadro de Orçamento com linhas de contagem e Carry Over separado em "Em Andamento"/"Em Hold"; Termo de Aceite do Go-Live como pré-requisito real da conclusão. Revisões anteriores: papel PROPRIETÁRIO e Licenciamento de Módulos; permissões por atividade com 4 verbos (Consultar/Incluir/Alterar/Deletar) e ativação de RLS nas tabelas centrais de controle de acesso; Cadastro de Produtos e Produto obrigatório na demanda; Agrupamento de Orçamento por Ano Fiscal/Área/Produto com novo Quadro de Orçamento; tela de Ajuste de Orçamento; e a padronização de nomenclatura.</w:t>
       </w:r>
     </w:p>
     <w:p>
@@ -169,6 +169,31 @@
     <w:p>
       <w:r>
         <w:t>✓ RESOLVIDO (Compasso) — As Ferramentas de Dev (reset e limpeza de base) foram atualizadas para as tabelas novas (produtos, autorizações de ajuste de orçamento); a criação de projeto de teste agora exige Produto.</w:t>
+      </w:r>
+    </w:p>
+    <w:p>
+      <w:r>
+        <w:t>✓ RESOLVIDO (Compasso) — Existe agora o Fechamento formal de Ano Fiscal (menu Ano Fiscal &gt; Fechamento Ano Fiscal): registra quem/quando/comentário, grava log, e só libera depois que todos os projetos do ano estão em Carryover, Hold ou Cancelado. É pré-requisito para abrir o próximo AF, junto com o AF anterior também fechado. É um marco distinto do fechamento do orçamento.</w:t>
+      </w:r>
+    </w:p>
+    <w:p>
+      <w:r>
+        <w:t>✓ RESOLVIDO (Compasso) — O tratamento de Carryover deixou de ser só uma marcação numa tela à parte: virou a aba "Avaliação Projetos Fechamento Ano Fiscal", com decisão explícita por projeto (Carryover Desenvolvimento / Carryover Hold / Cancelar / Reverter), log próprio e histórico no Detalhamento do Projeto. A antiga tela "Projetos Carry Over" foi removida.</w:t>
+      </w:r>
+    </w:p>
+    <w:p>
+      <w:r>
+        <w:t>✓ RESOLVIDO (Compasso) — O seletor de Ano Fiscal do Dashboard/Roadmap/Financeiro/Consulta passou a ser alimentado pela configuração de Anos Fiscais (lista de todos os AFs cadastrados + "Pipeline" + "Todos"), em vez de deduzir o "ano corrente" pela data do dia — o que ignorava a existência de mais de um AF configurado ao mesmo tempo.</w:t>
+      </w:r>
+    </w:p>
+    <w:p>
+      <w:r>
+        <w:t>✓ RESOLVIDO (Compasso) — No Quadro de Orçamento, a linha única de Carry Over virou duas ("Em Andamento" e "Em Hold"), e foram acrescentadas duas linhas de contagem de projetos (a gerar orçamento / com orçamento). O quadro "Projetos na Criação do Ano Fiscal" ganhou a linha de "Total de Projetos Cancelados".</w:t>
+      </w:r>
+    </w:p>
+    <w:p>
+      <w:r>
+        <w:t>✓ RESOLVIDO (Compasso) — O Termo de Aceite do Go-Live passou a ser pré-requisito real da conclusão: ao atingir 100% no Go-Live o projeto NÃO é mais encerrado automaticamente — fica "Pendente de Termo de Aceite" e só é concluído pela tela "Concluir Projeto/Subprojeto", depois do Termo. E o Termo não pode mais ser registrado antes dos 100% de evolução.</w:t>
       </w:r>
     </w:p>
     <w:p>
@@ -315,6 +340,16 @@
     <w:p>
       <w:r>
         <w:t>LACUNA (novo, Compasso) — A tela de Ajuste de Orçamento (Manual, seção 4.3) grava quem autorizou, quando, origem, destino, valor e justificativa, e é isso que libera a operação entre subgrupos no trade-off da Extraordinária. A movimentação de orçamento em si continua sendo feita manualmente nos processos de Carryover / Extraordinária — o sistema não recalcula nem transfere valores automaticamente a partir do registro.</w:t>
+      </w:r>
+    </w:p>
+    <w:p>
+      <w:r>
+        <w:t>⚠Fechamento de Ano Fiscal não movimenta os projetos</w:t>
+      </w:r>
+    </w:p>
+    <w:p>
+      <w:r>
+        <w:t>INFORMATIVO (novo, Compasso) — Fechar formalmente um Ano Fiscal (Manual, seção 4.2.1) grava o marco, o log e a pré-condição para abrir o próximo AF, mas por decisão de desenho NÃO altera nada nos projetos: não move orçamento, não muda fase nem status, não reprocessa o pool de Carryover. Todo o efeito prático vem das decisões projeto a projeto tomadas antes, na aba "Avaliação Projetos Fechamento Ano Fiscal".</w:t>
       </w:r>
     </w:p>
     <w:p>

</xml_diff>

<commit_message>
docs: SEGURANCA + Documento de Lacunas v6.0 for the budget-control/FY-period feature
SEGURANCA.md: new section documenting Controle Orçamentário (delegable),
Validação de Trade-off Extraordinário, and Período do Ano Fiscal.
Documento de Lacunas regenerated (v6.0). Manual_Funcional docx pending
(file open/locked) — content is ready in scratchpad.

Co-Authored-By: Claude Sonnet 5 <noreply@anthropic.com>
</commit_message>
<xml_diff>
--- a/docs/Documento_Lacunas_COMPASSO.docx
+++ b/docs/Documento_Lacunas_COMPASSO.docx
@@ -39,12 +39,12 @@
     </w:p>
     <w:p>
       <w:r>
-        <w:t>Versão 5.0 — 2 de setembro de 2026</w:t>
+        <w:t>Versão 6.0 — 3 de setembro de 2026</w:t>
       </w:r>
     </w:p>
     <w:p>
       <w:r>
-        <w:t>Atualizado após: tela de Fechamento Ano Fiscal (fechamento formal do AF + decisão de Carryover/Hold/Cancelamento projeto a projeto, substituindo "Projetos Carry Over"); seletor de Ano Fiscal alimentado pela configuração de Anos Fiscais (não pela data); Quadro de Orçamento com linhas de contagem e Carry Over separado em "Em Andamento"/"Em Hold"; Termo de Aceite do Go-Live como pré-requisito real da conclusão. Revisões anteriores: papel PROPRIETÁRIO e Licenciamento de Módulos; permissões por atividade com 4 verbos (Consultar/Incluir/Alterar/Deletar) e ativação de RLS nas tabelas centrais de controle de acesso; Cadastro de Produtos e Produto obrigatório na demanda; Agrupamento de Orçamento por Ano Fiscal/Área/Produto com novo Quadro de Orçamento; tela de Ajuste de Orçamento; e a padronização de nomenclatura.</w:t>
+        <w:t>Atualizado após (v6): parâmetro "Controle Orçamentário" (modo do trade-off da Extraordinária: Ano Fiscal / Área / Produto), tela "Validação de Trade-off Extraordinário", e "Período do Ano Fiscal" configurável. Atualizado após (v5): tela de Fechamento Ano Fiscal (fechamento formal do AF + decisão de Carryover/Hold/Cancelamento projeto a projeto, substituindo "Projetos Carry Over"); seletor de Ano Fiscal alimentado pela configuração de Anos Fiscais (não pela data); Quadro de Orçamento com linhas de contagem e Carry Over separado em "Em Andamento"/"Em Hold"; Termo de Aceite do Go-Live como pré-requisito real da conclusão. Revisões anteriores: papel PROPRIETÁRIO e Licenciamento de Módulos; permissões por atividade com 4 verbos (Consultar/Incluir/Alterar/Deletar) e ativação de RLS nas tabelas centrais de controle de acesso; Cadastro de Produtos e Produto obrigatório na demanda; Agrupamento de Orçamento por Ano Fiscal/Área/Produto com novo Quadro de Orçamento; tela de Ajuste de Orçamento; e a padronização de nomenclatura.</w:t>
       </w:r>
     </w:p>
     <w:p>
@@ -194,6 +194,16 @@
     <w:p>
       <w:r>
         <w:t>✓ RESOLVIDO (Compasso) — O Termo de Aceite do Go-Live passou a ser pré-requisito real da conclusão: ao atingir 100% no Go-Live o projeto NÃO é mais encerrado automaticamente — fica "Pendente de Termo de Aceite" e só é concluído pela tela "Concluir Projeto/Subprojeto", depois do Termo. E o Termo não pode mais ser registrado antes dos 100% de evolução.</w:t>
+      </w:r>
+    </w:p>
+    <w:p>
+      <w:r>
+        <w:t>✓ RESOLVIDO (Compasso, v6) — O período do Ano Fiscal deixou de ser abril–março fixo no código: virou o parâmetro "Período do Ano Fiscal" (Administração), com mês de início configurável e vigência. Quarters, rótulos "AFxxxx" e a grade de meses do Roadmap derivam desse parâmetro; sem nada cadastrado, o sistema segue em abril–março.</w:t>
+      </w:r>
+    </w:p>
+    <w:p>
+      <w:r>
+        <w:t>✓ RESOLVIDO (Compasso, v6) — A regra de "mesmo subgrupo" no trade-off da Demanda Extraordinária deixou de depender do seletor de tela do Dashboard/Financeiro: passou a vir do parâmetro persistido "Controle Orçamentário" (Ano Fiscal / Área / Produto). Trade-off que cruza subgrupo não é mais bloqueado — vai para a fila "Validação de Trade-off Extraordinário" (Ano Fiscal), aprovada com motivo e log.</w:t>
       </w:r>
     </w:p>
     <w:p>
@@ -360,6 +370,16 @@
     <w:p>
       <w:r>
         <w:t>LACUNA (novo, Compasso) — A regra de "mesmo subgrupo" (mesma Área ou mesmo Produto) é verificada no trade-off da Demanda Extraordinária. A marcação simples de Carryover não usa outro projeto como compensação, então não há o que verificar ali hoje; se uma mecânica de compensação no Carryover for criada, essa checagem precisará ser estendida.</w:t>
+      </w:r>
+    </w:p>
+    <w:p>
+      <w:r>
+        <w:t>ℹ Período do Ano Fiscal e modo de controle usam vigência, não reprocessam o passado</w:t>
+      </w:r>
+    </w:p>
+    <w:p>
+      <w:r>
+        <w:t>INFORMATIVO (novo, Compasso v6) — Mudar o "Período do Ano Fiscal" (15.10) vale a partir da vigência informada: datas anteriores continuam apuradas no período antigo, e o sistema não recalcula rótulos de AF/quarter de projetos já apurados. Da mesma forma, trocar o "Modo de Controle Orçamentário" (15.9) só afeta trade-offs novos — não reprocessa os já aprovados. E a tela "Ajuste de Orçamento" (4.3) continua existindo como registro de autorizações; a validação dos trade-offs que cruzam subgrupo passou para a tela nova "Validação de Trade-off Extraordinário" (4.4).</w:t>
       </w:r>
     </w:p>
     <w:p>

</xml_diff>